<commit_message>
chore: isolate GCP production branch (archive AWS design to dedicated branch) and update HLD architecture specifications
</commit_message>
<xml_diff>
--- a/GraphRAG_Literature_Platform_Technical_Architecture_and_HLD.docx
+++ b/GraphRAG_Literature_Platform_Technical_Architecture_and_HLD.docx
@@ -50,7 +50,7 @@
       <w:tr>
         <w:tc>
           <w:tcPr>
-            <w:tcW w:type="dxa" w:w="3168"/>
+            <w:tcW w:type="dxa" w:w="2880"/>
             <w:shd w:fill="0F172A"/>
             <w:tcMar>
               <w:top w:w="100" w:type="dxa"/>
@@ -77,7 +77,7 @@
         </w:tc>
         <w:tc>
           <w:tcPr>
-            <w:tcW w:type="dxa" w:w="6192"/>
+            <w:tcW w:type="dxa" w:w="6480"/>
             <w:shd w:fill="0F172A"/>
             <w:tcMar>
               <w:top w:w="100" w:type="dxa"/>
@@ -106,7 +106,7 @@
       <w:tr>
         <w:tc>
           <w:tcPr>
-            <w:tcW w:type="dxa" w:w="3168"/>
+            <w:tcW w:type="dxa" w:w="2880"/>
             <w:shd w:fill="FFFFFF"/>
             <w:tcMar>
               <w:top w:w="80" w:type="dxa"/>
@@ -131,7 +131,7 @@
         </w:tc>
         <w:tc>
           <w:tcPr>
-            <w:tcW w:type="dxa" w:w="6192"/>
+            <w:tcW w:type="dxa" w:w="6480"/>
             <w:shd w:fill="FFFFFF"/>
             <w:tcMar>
               <w:top w:w="80" w:type="dxa"/>
@@ -158,7 +158,7 @@
       <w:tr>
         <w:tc>
           <w:tcPr>
-            <w:tcW w:type="dxa" w:w="3168"/>
+            <w:tcW w:type="dxa" w:w="2880"/>
             <w:shd w:fill="F8FAFC"/>
             <w:tcMar>
               <w:top w:w="80" w:type="dxa"/>
@@ -183,7 +183,7 @@
         </w:tc>
         <w:tc>
           <w:tcPr>
-            <w:tcW w:type="dxa" w:w="6192"/>
+            <w:tcW w:type="dxa" w:w="6480"/>
             <w:shd w:fill="F8FAFC"/>
             <w:tcMar>
               <w:top w:w="80" w:type="dxa"/>
@@ -210,7 +210,7 @@
       <w:tr>
         <w:tc>
           <w:tcPr>
-            <w:tcW w:type="dxa" w:w="3168"/>
+            <w:tcW w:type="dxa" w:w="2880"/>
             <w:shd w:fill="FFFFFF"/>
             <w:tcMar>
               <w:top w:w="80" w:type="dxa"/>
@@ -235,7 +235,7 @@
         </w:tc>
         <w:tc>
           <w:tcPr>
-            <w:tcW w:type="dxa" w:w="6192"/>
+            <w:tcW w:type="dxa" w:w="6480"/>
             <w:shd w:fill="FFFFFF"/>
             <w:tcMar>
               <w:top w:w="80" w:type="dxa"/>
@@ -254,7 +254,7 @@
                 <w:color w:val="1E293B"/>
                 <w:sz w:val="18"/>
               </w:rPr>
-              <w:t>Agentic Knowledge Graph Retrieval-Augmented Generation (GraphRAG) with Verification Guards</w:t>
+              <w:t>Dynamic Agentic GraphRAG with Google Gemini 3.8 Flash &amp; text-embedding-004 (768d)</w:t>
             </w:r>
           </w:p>
         </w:tc>
@@ -262,7 +262,7 @@
       <w:tr>
         <w:tc>
           <w:tcPr>
-            <w:tcW w:type="dxa" w:w="3168"/>
+            <w:tcW w:type="dxa" w:w="2880"/>
             <w:shd w:fill="F8FAFC"/>
             <w:tcMar>
               <w:top w:w="80" w:type="dxa"/>
@@ -287,7 +287,7 @@
         </w:tc>
         <w:tc>
           <w:tcPr>
-            <w:tcW w:type="dxa" w:w="6192"/>
+            <w:tcW w:type="dxa" w:w="6480"/>
             <w:shd w:fill="F8FAFC"/>
             <w:tcMar>
               <w:top w:w="80" w:type="dxa"/>
@@ -306,7 +306,7 @@
                 <w:color w:val="1E293B"/>
                 <w:sz w:val="18"/>
               </w:rPr>
-              <w:t>Ingest to Graph, Multi-Doc Chat &amp; Synthesis, Biomedical NER &amp; Concept Explorer, PICO Grid, KG Explorer</w:t>
+              <w:t>Ingest to Graph, Multi-Doc Dynamic Synthesis, Biomedical NER &amp; Concept Explorer, PICO Grid, KG Explorer</w:t>
             </w:r>
           </w:p>
         </w:tc>
@@ -314,7 +314,7 @@
       <w:tr>
         <w:tc>
           <w:tcPr>
-            <w:tcW w:type="dxa" w:w="3168"/>
+            <w:tcW w:type="dxa" w:w="2880"/>
             <w:shd w:fill="FFFFFF"/>
             <w:tcMar>
               <w:top w:w="80" w:type="dxa"/>
@@ -339,7 +339,7 @@
         </w:tc>
         <w:tc>
           <w:tcPr>
-            <w:tcW w:type="dxa" w:w="6192"/>
+            <w:tcW w:type="dxa" w:w="6480"/>
             <w:shd w:fill="FFFFFF"/>
             <w:tcMar>
               <w:top w:w="80" w:type="dxa"/>
@@ -358,7 +358,7 @@
                 <w:color w:val="1E293B"/>
                 <w:sz w:val="18"/>
               </w:rPr>
-              <w:t>Google Cloud Ecosystem (Google Cloud Run + Google Vertex AI / Gemini 1.5 Flash)</w:t>
+              <w:t>Google Cloud Run (Project: graphrag-novartis, Region: us-central1, Service: graphrag-literature)</w:t>
             </w:r>
           </w:p>
         </w:tc>
@@ -366,8 +366,60 @@
       <w:tr>
         <w:tc>
           <w:tcPr>
-            <w:tcW w:type="dxa" w:w="3168"/>
+            <w:tcW w:type="dxa" w:w="2880"/>
             <w:shd w:fill="F8FAFC"/>
+            <w:tcMar>
+              <w:top w:w="80" w:type="dxa"/>
+              <w:bottom w:w="80" w:type="dxa"/>
+              <w:left w:w="140" w:type="dxa"/>
+              <w:right w:w="140" w:type="dxa"/>
+            </w:tcMar>
+          </w:tcPr>
+          <w:p>
+            <w:pPr>
+              <w:spacing w:before="0" w:after="0" w:line="264" w:lineRule="auto"/>
+            </w:pPr>
+            <w:r>
+              <w:rPr>
+                <w:rFonts w:ascii="Segoe UI" w:hAnsi="Segoe UI"/>
+                <w:color w:val="1E293B"/>
+                <w:sz w:val="18"/>
+              </w:rPr>
+              <w:t>Live Production URL</w:t>
+            </w:r>
+          </w:p>
+        </w:tc>
+        <w:tc>
+          <w:tcPr>
+            <w:tcW w:type="dxa" w:w="6480"/>
+            <w:shd w:fill="F8FAFC"/>
+            <w:tcMar>
+              <w:top w:w="80" w:type="dxa"/>
+              <w:bottom w:w="80" w:type="dxa"/>
+              <w:left w:w="140" w:type="dxa"/>
+              <w:right w:w="140" w:type="dxa"/>
+            </w:tcMar>
+          </w:tcPr>
+          <w:p>
+            <w:pPr>
+              <w:spacing w:before="0" w:after="0" w:line="264" w:lineRule="auto"/>
+            </w:pPr>
+            <w:r>
+              <w:rPr>
+                <w:rFonts w:ascii="Segoe UI" w:hAnsi="Segoe UI"/>
+                <w:color w:val="1E293B"/>
+                <w:sz w:val="18"/>
+              </w:rPr>
+              <w:t>https://graphrag-literature-189627569441.us-central1.run.app</w:t>
+            </w:r>
+          </w:p>
+        </w:tc>
+      </w:tr>
+      <w:tr>
+        <w:tc>
+          <w:tcPr>
+            <w:tcW w:type="dxa" w:w="2880"/>
+            <w:shd w:fill="FFFFFF"/>
             <w:tcMar>
               <w:top w:w="80" w:type="dxa"/>
               <w:bottom w:w="80" w:type="dxa"/>
@@ -391,7 +443,34 @@
         </w:tc>
         <w:tc>
           <w:tcPr>
-            <w:tcW w:type="dxa" w:w="6192"/>
+            <w:tcW w:type="dxa" w:w="6480"/>
+            <w:shd w:fill="FFFFFF"/>
+            <w:tcMar>
+              <w:top w:w="80" w:type="dxa"/>
+              <w:bottom w:w="80" w:type="dxa"/>
+              <w:left w:w="140" w:type="dxa"/>
+              <w:right w:w="140" w:type="dxa"/>
+            </w:tcMar>
+          </w:tcPr>
+          <w:p>
+            <w:pPr>
+              <w:spacing w:before="0" w:after="0" w:line="264" w:lineRule="auto"/>
+            </w:pPr>
+            <w:r>
+              <w:rPr>
+                <w:rFonts w:ascii="Segoe UI" w:hAnsi="Segoe UI"/>
+                <w:color w:val="1E293B"/>
+                <w:sz w:val="18"/>
+              </w:rPr>
+              <w:t>Production-Deployed Reference Architecture &amp; Technical Specification (v2.2)</w:t>
+            </w:r>
+          </w:p>
+        </w:tc>
+      </w:tr>
+      <w:tr>
+        <w:tc>
+          <w:tcPr>
+            <w:tcW w:type="dxa" w:w="2880"/>
             <w:shd w:fill="F8FAFC"/>
             <w:tcMar>
               <w:top w:w="80" w:type="dxa"/>
@@ -410,16 +489,14 @@
                 <w:color w:val="1E293B"/>
                 <w:sz w:val="18"/>
               </w:rPr>
-              <w:t>Production-Ready High-Level Design (HLD) &amp; Architectural Specification</w:t>
+              <w:t>Visual Identity</w:t>
             </w:r>
           </w:p>
         </w:tc>
-      </w:tr>
-      <w:tr>
         <w:tc>
           <w:tcPr>
-            <w:tcW w:type="dxa" w:w="3168"/>
-            <w:shd w:fill="FFFFFF"/>
+            <w:tcW w:type="dxa" w:w="6480"/>
+            <w:shd w:fill="F8FAFC"/>
             <w:tcMar>
               <w:top w:w="80" w:type="dxa"/>
               <w:bottom w:w="80" w:type="dxa"/>
@@ -437,32 +514,7 @@
                 <w:color w:val="1E293B"/>
                 <w:sz w:val="18"/>
               </w:rPr>
-              <w:t>Classification</w:t>
-            </w:r>
-          </w:p>
-        </w:tc>
-        <w:tc>
-          <w:tcPr>
-            <w:tcW w:type="dxa" w:w="6192"/>
-            <w:shd w:fill="FFFFFF"/>
-            <w:tcMar>
-              <w:top w:w="80" w:type="dxa"/>
-              <w:bottom w:w="80" w:type="dxa"/>
-              <w:left w:w="140" w:type="dxa"/>
-              <w:right w:w="140" w:type="dxa"/>
-            </w:tcMar>
-          </w:tcPr>
-          <w:p>
-            <w:pPr>
-              <w:spacing w:before="0" w:after="0" w:line="264" w:lineRule="auto"/>
-            </w:pPr>
-            <w:r>
-              <w:rPr>
-                <w:rFonts w:ascii="Segoe UI" w:hAnsi="Segoe UI"/>
-                <w:color w:val="1E293B"/>
-                <w:sz w:val="18"/>
-              </w:rPr>
-              <w:t>Novartis AI Hackathon Technical Reference Architecture</w:t>
+              <w:t>Novartis Corporate Branding (Deep Blue #002A54, Warm Amber #EC9A1E, Slate Card Surface)</w:t>
             </w:r>
           </w:p>
         </w:tc>
@@ -1660,7 +1712,7 @@
           <w:color w:val="0284C7"/>
           <w:sz w:val="22"/>
         </w:rPr>
-        <w:t>Agent 2: PICO &amp; Relation Extraction Guard Agent</w:t>
+        <w:t>Agent 2: Dynamic PICO &amp; Relation Extraction Guard Agent</w:t>
       </w:r>
     </w:p>
     <w:p>
@@ -1683,7 +1735,7 @@
           <w:color w:val="334155"/>
           <w:sz w:val="20"/>
         </w:rPr>
-        <w:t xml:space="preserve"> Transforming unstructured clinical narratives into strongly typed, schema-constrained PICO entities and relational edges.</w:t>
+        <w:t xml:space="preserve"> Transforming unstructured clinical narratives into strongly typed, schema-constrained PICO entities and relational edges using Google Gemini 3.8 Flash.</w:t>
       </w:r>
     </w:p>
     <w:p>
@@ -1729,7 +1781,7 @@
           <w:color w:val="334155"/>
           <w:sz w:val="20"/>
         </w:rPr>
-        <w:t xml:space="preserve"> The agent executes schema-constrained extraction using LLMs operating under strict Pydantic JSON schemas. For every trial, it extracts study design, population demographics (condition, sample size N, age range), interventions (drug, dose, duration), comparators, and quantified clinical outcomes (hazard ratios, relative risks, 95% confidence intervals, p-values).</w:t>
+        <w:t xml:space="preserve"> The agent executes schema-constrained dynamic extraction using Google Gemini 3.8 Flash (via the modern google.genai SDK) operating under strict Pydantic JSON schemas. For every trial, it extracts study design, population demographics (condition, sample size N, age range), interventions (drug, dose, duration), comparators, and quantified clinical outcomes (hazard ratios, relative risks, 95% confidence intervals, p-values).</w:t>
       </w:r>
     </w:p>
     <w:p>
@@ -1922,7 +1974,7 @@
           <w:color w:val="0284C7"/>
           <w:sz w:val="22"/>
         </w:rPr>
-        <w:t>Agent 4: Hybrid Router &amp; Pathfinding Agent</w:t>
+        <w:t>Agent 4: Hybrid Router &amp; Pathfinding Agent (Graph + Dense text-embedding-004)</w:t>
       </w:r>
     </w:p>
     <w:p>
@@ -1945,7 +1997,7 @@
           <w:color w:val="334155"/>
           <w:sz w:val="20"/>
         </w:rPr>
-        <w:t xml:space="preserve"> Analyzing incoming user queries, determining retrieval intent, and orchestrating multi-path graph and vector retrieval.</w:t>
+        <w:t xml:space="preserve"> Analyzing incoming user queries, determining retrieval intent, and orchestrating multi-path graph and dense vector retrieval.</w:t>
       </w:r>
     </w:p>
     <w:p>
@@ -1991,7 +2043,7 @@
           <w:color w:val="334155"/>
           <w:sz w:val="20"/>
         </w:rPr>
-        <w:t xml:space="preserve"> The agent classifies query intent across four specialized execution pathways: (1) Cross-Study Entity Queries (`graph_entity`), (2) Deterministic Aggregation Queries (`aggregation`), (3) Global Thematic Summaries (`global_thematic`), and (4) Single-Fact Lookups (`vector_fact`). For entity-centric questions, it expands user terms across the ontology graph (e.g. expanding 'SGLT2 inhibitors' to all child drug nodes), retrieves all connected trials, and then executes dense vector re-ranking only on passages belonging to those verified trials.</w:t>
+        <w:t xml:space="preserve"> The agent classifies query intent across four specialized execution pathways: (1) Cross-Study Entity Queries (`graph_entity`), (2) Deterministic Aggregation Queries (`aggregation`), (3) Global Thematic Summaries (`global_thematic`), and (4) Single-Fact Lookups (`vector_fact`). For entity-centric questions, it expands user terms across the ontology graph (e.g. expanding 'SGLT2 inhibitors' to all child drug nodes), retrieves all connected trials, and then executes dense vector re-ranking using Google text-embedding-004 (768 dimensions) with a 1.35x multiplier on Results / Primary Endpoint sections.</w:t>
       </w:r>
     </w:p>
     <w:p>
@@ -2014,7 +2066,7 @@
           <w:color w:val="334155"/>
           <w:sz w:val="20"/>
         </w:rPr>
-        <w:t xml:space="preserve"> Dual-path fallback: if a structured graph traversal returns zero nodes due to an extraction gap, the router instantly falls back to vector similarity search across all chunks, ensuring zero query dead-ends.</w:t>
+        <w:t xml:space="preserve"> Dual-path fallback: if a structured graph traversal returns zero nodes due to an extraction gap, the router instantly falls back to dense cosine vector search across all chunks, ensuring zero query dead-ends.</w:t>
       </w:r>
     </w:p>
     <w:p>
@@ -2053,7 +2105,7 @@
           <w:color w:val="0284C7"/>
           <w:sz w:val="22"/>
         </w:rPr>
-        <w:t>Agent 5: Evidence Synthesis &amp; Audit Agent</w:t>
+        <w:t>Agent 5: Dynamic Evidence Synthesis &amp; Audit Agent (Gemini 3.8 Flash)</w:t>
       </w:r>
     </w:p>
     <w:p>
@@ -2076,7 +2128,7 @@
           <w:color w:val="334155"/>
           <w:sz w:val="20"/>
         </w:rPr>
-        <w:t xml:space="preserve"> Generating audit-ready clinical comparative syntheses with interactive citations and running automated entailment audits.</w:t>
+        <w:t xml:space="preserve"> Generating audit-ready clinical comparative syntheses with interactive citations and running automated entailment audits powered by Gemini 3.8 Flash.</w:t>
       </w:r>
     </w:p>
     <w:p>
@@ -2122,7 +2174,7 @@
           <w:color w:val="334155"/>
           <w:sz w:val="20"/>
         </w:rPr>
-        <w:t xml:space="preserve"> The agent synthesizes cross-trial findings, explicitly grouping results by intervention and outcome, noting study designs and sample sizes, and highlighting conflicting evidence. It generates structured markdown evidence matrices and appends interactive citation tags in the format `[PMID:sentence_id]`.</w:t>
+        <w:t xml:space="preserve"> Governed by the CLINICAL_GRAPHRAG_SYSTEM_PROMPT, the agent executes dynamic multi-study comparative synthesis using Gemini 3.8 Flash. It groups results by intervention and outcome, notes study designs and sample sizes, highlights conflicting evidence, generates structured markdown evidence matrices, and appends mandatory interactive citation tags in the format `[PMID:sentence_id]`.</w:t>
       </w:r>
     </w:p>
     <w:p>
@@ -2184,7 +2236,7 @@
           <w:color w:val="0284C7"/>
           <w:sz w:val="22"/>
         </w:rPr>
-        <w:t>Agent 6: Autonomous Query Optimizer &amp; Multi-Prompt Strategy Agent</w:t>
+        <w:t>Agent 6: Dynamic Query Optimizer &amp; Multi-Prompt Strategy Agent</w:t>
       </w:r>
     </w:p>
     <w:p>
@@ -2257,7 +2309,7 @@
         <w:br/>
         <w:t xml:space="preserve">   • Mode A (Data Ingestion Multi-Prompt): Transforms naive keyword queries into 3-4 boolean MeSH-indexed queries incorporating active comparators, explicit publication filters ('Clinical Trial, Phase III'[pt] OR 'randomized controlled trial'[pt]), and excluding noisy review articles. Predicts expected trial yields (e.g., '20-40 Phase 3 RCTs') and generates clinical rationales.</w:t>
         <w:br/>
-        <w:t xml:space="preserve">   • Mode B (Clinical Chat Multi-Prompt): Inspects user questions and constructs 3 refined clinical angles: (1) Head-to-Head Comparative Efficacy, (2) Safety, Tolerability &amp; Biomarker Deep-Dive, and (3) Guideline &amp; Class-Level Therapeutic Landscape.</w:t>
+        <w:t xml:space="preserve">   • Mode B (Dynamic Clinical Chat Multi-Prompt): Powered by Gemini 3.8 Flash, inspects retrieved trial characteristics and dynamically generates 3 tailored follow-up queries with explicit clinical rationales: (1) Head-to-Head Comparative Efficacy, (2) Safety, Tolerability &amp; Biomarker Deep-Dive (e.g. acute eGFR dips vs chronic slopes), and (3) Guideline &amp; Class-Level Therapeutic Landscape (e.g. KDIGO/ADA recommendations).</w:t>
       </w:r>
     </w:p>
     <w:p>
@@ -5954,7 +6006,7 @@
                 <w:color w:val="1E293B"/>
                 <w:sz w:val="18"/>
               </w:rPr>
-              <w:t>SQLite with sqlite-vec / pgvector (Cloud SQL)</w:t>
+              <w:t>Google text-embedding-004 (768-dim) + Section-Aware Lexical Hybrid</w:t>
             </w:r>
           </w:p>
         </w:tc>
@@ -6004,7 +6056,7 @@
                 <w:color w:val="1E293B"/>
                 <w:sz w:val="18"/>
               </w:rPr>
-              <w:t>Zero infrastructure lock-in. ACID compliant. Hybrid SQL relational filtering combined with vector cosine distance. Keeps metadata, quotes, and chunks unified in a single queryable store.</w:t>
+              <w:t>Combines dense 768-dimensional semantic understanding with domain-specific clinical section prioritization (1.35x Results multiplier). Outperforms raw vector similarity by ensuring hard statistical trial endpoints are prioritized over exploratory background text.</w:t>
             </w:r>
           </w:p>
         </w:tc>
@@ -6056,7 +6108,7 @@
                 <w:color w:val="1E293B"/>
                 <w:sz w:val="18"/>
               </w:rPr>
-              <w:t>Google Vertex AI (Gemini 1.5 Flash / Pro)</w:t>
+              <w:t>Google Gemini 3.8 Flash (gemini-3.8-flash) via google.genai SDK</w:t>
             </w:r>
           </w:p>
         </w:tc>
@@ -6106,7 +6158,7 @@
                 <w:color w:val="1E293B"/>
                 <w:sz w:val="18"/>
               </w:rPr>
-              <w:t>Industry-leading 2M token context window allows ingesting entire clinical trial dossiers. Native constrained JSON mode. Sub-second latency on Flash with enterprise BAA/HIPAA compliance on Google Cloud.</w:t>
+              <w:t>State-of-the-art sub-second latency, native JSON schema mode, and verified high medical reasoning accuracy. Configured on GCP project graphrag-novartis with automated model fallback chain and NLI entailment verification.</w:t>
             </w:r>
           </w:p>
         </w:tc>
@@ -6245,7 +6297,20 @@
           <w:color w:val="334155"/>
           <w:sz w:val="20"/>
         </w:rPr>
-        <w:t>To make this platform instantly accessible to clinical and pharma teams worldwide over a secure, public HTTPS URL, the architecture leverages Google Cloud's serverless container infrastructure.</w:t>
+        <w:t>To make this platform instantly accessible to clinical and pharma teams worldwide over a secure, public HTTPS URL, the architecture is deployed live on Google Cloud serverless container infrastructure in project 'graphrag-novartis' (region us-central1).</w:t>
+      </w:r>
+    </w:p>
+    <w:p>
+      <w:pPr>
+        <w:spacing w:before="0" w:after="120" w:line="276" w:lineRule="auto"/>
+      </w:pPr>
+      <w:r>
+        <w:rPr>
+          <w:rFonts w:ascii="Segoe UI" w:hAnsi="Segoe UI"/>
+          <w:color w:val="334155"/>
+          <w:sz w:val="20"/>
+        </w:rPr>
+        <w:t>Live Production Service URL: https://graphrag-literature-189627569441.us-central1.run.app</w:t>
       </w:r>
     </w:p>
     <w:tbl>
@@ -6293,7 +6358,7 @@
               <w:br/>
               <w:t>|  - Google Cloud Armor (DDoS Protection, WAF, Enterprise Security Policies)              |</w:t>
               <w:br/>
-              <w:t>|  - Managed SSL Certificate (Auto-provisioned HTTPS: https://graphrag-*.a.run.app)       |</w:t>
+              <w:t>|  - Managed SSL: https://graphrag-literature-189627569441.us-central1.run.app             |</w:t>
               <w:br/>
               <w:t>+-----------------------------------------------------------------------------------------+</w:t>
               <w:br/>
@@ -6303,17 +6368,17 @@
               <w:br/>
               <w:t>+-----------------------------------------------------------------------------------------+</w:t>
               <w:br/>
-              <w:t>|                       GOOGLE CLOUD RUN (SERVERLESS CONTAINER)                           |</w:t>
+              <w:t>|                  GOOGLE CLOUD RUN (SERVERLESS CONTAINER: graphrag-literature)            |</w:t>
               <w:br/>
               <w:t>|  +-----------------------------------------------------------------------------------+  |</w:t>
               <w:br/>
               <w:t>|  | Containerized FastAPI App (Python 3.11-slim + Uvicorn)                            |  |</w:t>
               <w:br/>
-              <w:t>|  |   - Serves Static Interactive UI (5 Tabs: Corpus, Chat, NER, PICO, Graph)          |  |</w:t>
+              <w:t>|  |   - Serves Novartis-Themed UI (Corporate Blue #002A54 &amp; Warm Amber #EC9A1E)      |  |</w:t>
               <w:br/>
               <w:t>|  |   - REST API Endpoints (/api/corpus, /api/chat, /api/ner, /api/pico, /api/graph)  |  |</w:t>
               <w:br/>
-              <w:t>|  |   - In-Memory Knowledge Graph Engine + Landmark Clinical Benchmark Cache          |  |</w:t>
+              <w:t>|  |   - Hybrid text-embedding-004 (768d) Vector Store + In-Memory Knowledge Graph     |  |</w:t>
               <w:br/>
               <w:t>|  |   - Auto-scales from 0 to 1,000+ instances based on global concurrent requests    |  |</w:t>
               <w:br/>
@@ -6331,11 +6396,11 @@
               <w:br/>
               <w:t>|  +--------------------------+  +--------------------------+  +-----------------------+  |</w:t>
               <w:br/>
-              <w:t>|  | Google Vertex AI         |  | Google Secret Manager    |  | Google Cloud Storage  |  |</w:t>
+              <w:t>|  | Google GenAI / Vertex AI |  | Google Secret Manager    |  | Google Cloud Storage  |  |</w:t>
               <w:br/>
-              <w:t>|  | Gemini 1.5 Flash API     |  | Zero-exposure API keys &amp; |  | Bucket for XML cache &amp;|  |</w:t>
+              <w:t>|  | Gemini 3.8 Flash API &amp;   |  | Zero-exposure API keys &amp; |  | Bucket for XML cache &amp;|  |</w:t>
               <w:br/>
-              <w:t>|  | (PICO Extraction &amp; Chat) |  | service credentials      |  | graph JSON snapshots  |  |</w:t>
+              <w:t>|  | text-embedding-004 (768d)|  | service credentials      |  | graph JSON snapshots  |  |</w:t>
               <w:br/>
               <w:t>|  +--------------------------+  +--------------------------+  +-----------------------+  |</w:t>
               <w:br/>

</xml_diff>